<commit_message>
feat: implement godown vs shop stock separation, transfer challans, and independent outflow ledgers
</commit_message>
<xml_diff>
--- a/Pabna_Bostraloy_POS_User_Manual.docx
+++ b/Pabna_Bostraloy_POS_User_Manual.docx
@@ -2041,7 +2041,7 @@
           <w:color w:val="0F766E"/>
           <w:sz w:val="26"/>
         </w:rPr>
-        <w:t>৪.৫ গোডাউন চালান ট্রান্সফার (Stock Transfers Lifecycle)</w:t>
+        <w:t>৪.৫ গোডাউন ও দোকান স্টক পৃথকীকরণ ও চালান স্থানান্তর (Godown vs Shop Multi-Location Stock)</w:t>
       </w:r>
     </w:p>
     <w:p>
@@ -2052,7 +2052,7 @@
         <w:rPr>
           <w:color w:val="334155"/>
         </w:rPr>
-        <w:t>মূল গোডাউন থেকে দোকানে অথবা এক শাখা থেকে অন্য শাখায় কাপড় স্থানান্তরের নিরাপদ ট্র্যাকিং ব্যবস্থা:</w:t>
+        <w:t>পাবনা বস্ত্রালয়ের কেন্দ্রীয় গোডাউন ও বিক্রয় কাউন্টারের মাল আলাদা রাখার জন্য এই মডিউলটি অত্যন্ত কার্যকরী:</w:t>
       </w:r>
     </w:p>
     <w:p>
@@ -2064,13 +2064,13 @@
           <w:b/>
           <w:color w:val="0F172A"/>
         </w:rPr>
-        <w:t xml:space="preserve">• চালান তৈরি: </w:t>
+        <w:t xml:space="preserve">• পৃথক স্টক ট্র্যাকিং: </w:t>
       </w:r>
       <w:r>
         <w:rPr>
           <w:color w:val="334155"/>
         </w:rPr>
-        <w:t>কোন গোডাউন থেকে কোন দোকানে কত পিস কাপড় পাঠানো হচ্ছে তার চালান তৈরি (স্ট্যাটাস: In Transit)।</w:t>
+        <w:t>প্রতিটি কাপড়ের জন্য গোডাউনে কতটুকু মজুত আছে (Godown Stock) এবং দোকানে বিক্রির জন্য কতটুকু সাজানো আছে (Shop Stock) তা সম্পূর্ণ আলাদা ট্র্যাক হয়। ক্যাটালগ ও পিওএস স্ক্রিনেও এক নজরে গোডাউন ও দোকান স্টক স্পষ্ট দেখা যায়।</w:t>
       </w:r>
     </w:p>
     <w:p>
@@ -2082,13 +2082,85 @@
           <w:b/>
           <w:color w:val="0F172A"/>
         </w:rPr>
-        <w:t xml:space="preserve">• চালান রিসিভ ও স্টক বৃদ্ধি: </w:t>
+        <w:t xml:space="preserve">• গোডাউন থেকে চালান প্রেরণ: </w:t>
       </w:r>
       <w:r>
         <w:rPr>
           <w:color w:val="334155"/>
         </w:rPr>
-        <w:t>দোকানের ম্যানেজার কাপড়গুলো গুনে বুঝে পেয়ে চালানের 'Received' বাটন চাপলে স্বয়ংক্রিয়ভাবে দোকানের স্টকে পণ্য যোগ হয়ে যায়।</w:t>
+        <w:t>গোডাউন থেকে দোকানে মালামাল পাঠাতে চালান তৈরি করুন। চালানে মালামাল যুক্ত হওয়ার সাথে সাথে তা গোডাউন স্টক থেকে কমে 'In Transit' (পথে আছে) হিসেবে রেকর্ড হয় এবং প্রিন্টযোগ্য গেটপাস তৈরি হয়।</w:t>
+      </w:r>
+    </w:p>
+    <w:p>
+      <w:pPr>
+        <w:spacing w:before="20" w:after="80" w:line="276" w:lineRule="auto"/>
+      </w:pPr>
+      <w:r>
+        <w:rPr>
+          <w:b/>
+          <w:color w:val="0F172A"/>
+        </w:rPr>
+        <w:t xml:space="preserve">• দোকানে চালান গ্রহণ ও রিসিভিং: </w:t>
+      </w:r>
+      <w:r>
+        <w:rPr>
+          <w:color w:val="334155"/>
+        </w:rPr>
+        <w:t>দোকানে মাল এসে পৌঁছালে ম্যানেজার বা ক্যাশিয়ার চালানটি দেখে 'দোকানে রিসিভ করুন' বাটনে ক্লিক করেন। সাথে সাথে পণ্যটি দোকানের বিক্রয়যোগ্য স্টকে যোগ হয় এবং রিসিভিং খতিয়ানে অন্তর্ভুক্ত হয়।</w:t>
+      </w:r>
+    </w:p>
+    <w:p>
+      <w:pPr>
+        <w:spacing w:before="20" w:after="80" w:line="276" w:lineRule="auto"/>
+      </w:pPr>
+      <w:r>
+        <w:rPr>
+          <w:b/>
+          <w:color w:val="0F172A"/>
+        </w:rPr>
+        <w:t xml:space="preserve">• গোডাউন কমার পৃথক খাতা (Godown Outflow Ledger): </w:t>
+      </w:r>
+      <w:r>
+        <w:rPr>
+          <w:color w:val="334155"/>
+        </w:rPr>
+        <w:t>গোডাউন থেকে কী কী কাপড় কমেছে (দোকানে চালান স্থানান্তর, গোডাউন ড্যামেজ, কিংবা মহাজনকে ফেরত) তার সম্পূর্ণ পৃথক তারিখভিত্তিক খতিয়ান পাওয়া যায়। কমার পূর্বে কত ছিল এবং কমার পর অবশিষ্ট কত আছে তা নিখুঁতভাবে প্রদর্শিত হয় এবং ১-ক্লিকে এক্সেল (CSV) ডাউনলোড করা যায়।</w:t>
+      </w:r>
+    </w:p>
+    <w:p>
+      <w:pPr>
+        <w:spacing w:before="20" w:after="80" w:line="276" w:lineRule="auto"/>
+      </w:pPr>
+      <w:r>
+        <w:rPr>
+          <w:b/>
+          <w:color w:val="0F172A"/>
+        </w:rPr>
+        <w:t xml:space="preserve">• দোকান কমার পৃথক খাতা (Shop Outflow Ledger): </w:t>
+      </w:r>
+      <w:r>
+        <w:rPr>
+          <w:color w:val="334155"/>
+        </w:rPr>
+        <w:t>দোকানে মাল আসার পর তা কী কী কারণে কমেছে (কাউন্টার পিওএস বিক্রয়, টেইলারিং কার্যাদেশে মাপ অনুযায়ী থান কাপড় কাটা, থান কাপড়ের ছাঁট/অপচয় কিংবা দোকান ড্যামেজ) তার সম্পূর্ণ আলাদা বিস্তারিত খতিয়ান পাওয়া যায় এবং ১-ক্লিকে এক্সেল ডাউনলোড করা যায়।</w:t>
+      </w:r>
+    </w:p>
+    <w:p>
+      <w:pPr>
+        <w:spacing w:before="20" w:after="80" w:line="276" w:lineRule="auto"/>
+      </w:pPr>
+      <w:r>
+        <w:rPr>
+          <w:b/>
+          <w:color w:val="0F172A"/>
+        </w:rPr>
+        <w:t xml:space="preserve">• দ্রুত স্টক সমন্বয় (Stock Adjustment): </w:t>
+      </w:r>
+      <w:r>
+        <w:rPr>
+          <w:color w:val="334155"/>
+        </w:rPr>
+        <w:t>কোনো পণ্যের গোডাউন বা দোকান স্টক প্রয়োজনে অডিট কারণ ও নোটসহ সরাসরি বৃদ্ধি (+), হ্রাস (-) বা নতুন মানে সেট (=) করা যায়।</w:t>
       </w:r>
     </w:p>
     <w:p>

</xml_diff>